<commit_message>
docs: replace AI-Education requirement and design documents
</commit_message>
<xml_diff>
--- a/docs/outline-design/AI-Education系统概要设计说明书.docx
+++ b/docs/outline-design/AI-Education系统概要设计说明书.docx
@@ -159,12 +159,10 @@
       </w:pPr>
       <w:r>
         <w:rPr>
-          <w:rFonts w:ascii="Microsoft YaHei" w:hAnsi="Microsoft YaHei" w:eastAsia="Microsoft YaHei"/>
-          <w:b w:val="0"/>
-          <w:color w:val="1F2937"/>
+          <w:rFonts w:ascii="宋体" w:hAnsi="宋体" w:eastAsia="宋体"/>
           <w:sz w:val="21"/>
         </w:rPr>
-        <w:t>系统总体采用用户访问层、前端应用层、统一接口层、业务服务层、数据访问层和外部能力层的分层结构。前端负责页面组织、表单交互、角色导航和可视化展示；后端通过 FastAPI 汇聚业务接口，完成认证、权限校验、业务编排、智能服务调用和数据持久化；数据访问层统一连接 MySQL 业务库，并管理文件资源、RAG 索引和日志记录。</w:t>
+        <w:t>系统总体采用用户访问层、前端应用层、统一接口层、业务服务层、数据访问层和外部能力层的分层结构。前端负责页面组织、表单交互、角色导航和可视化展示；后端通过 FastAPI 汇聚业务接口，完成认证、权限校验、业务编排、智能服务调用和数据持久化；数据访问层统一连接 MySQL 业务库，并管理文件资源、RAG 索引和日志记录。图 2-1 从系统总体分层角度说明系统组成，图 2-2 从工程实现角度补充说明多智能体工作流、共享数据表面、模块数据管道以及外部能力接入关系。</w:t>
       </w:r>
     </w:p>
     <w:p>
@@ -756,6 +754,144 @@
       </w:tr>
     </w:tbl>
     <w:p/>
+    <w:p>
+      <w:pPr>
+        <w:spacing w:before="120" w:after="40"/>
+        <w:jc w:val="center"/>
+      </w:pPr>
+      <w:r>
+        <w:drawing>
+          <wp:inline xmlns:a="http://schemas.openxmlformats.org/drawingml/2006/main" xmlns:pic="http://schemas.openxmlformats.org/drawingml/2006/picture">
+            <wp:extent cx="5806440" cy="3796518"/>
+            <wp:docPr id="4" name="Picture 4"/>
+            <wp:cNvGraphicFramePr>
+              <a:graphicFrameLocks noChangeAspect="1"/>
+            </wp:cNvGraphicFramePr>
+            <a:graphic>
+              <a:graphicData uri="http://schemas.openxmlformats.org/drawingml/2006/picture">
+                <pic:pic>
+                  <pic:nvPicPr>
+                    <pic:cNvPr id="0" name="figure_2_1_ai_edu_system_architecture_reference_style.png"/>
+                    <pic:cNvPicPr/>
+                  </pic:nvPicPr>
+                  <pic:blipFill>
+                    <a:blip r:embed="rId12"/>
+                    <a:stretch>
+                      <a:fillRect/>
+                    </a:stretch>
+                  </pic:blipFill>
+                  <pic:spPr>
+                    <a:xfrm>
+                      <a:off x="0" y="0"/>
+                      <a:ext cx="5806440" cy="3796518"/>
+                    </a:xfrm>
+                    <a:prstGeom prst="rect"/>
+                  </pic:spPr>
+                </pic:pic>
+              </a:graphicData>
+            </a:graphic>
+          </wp:inline>
+        </w:drawing>
+      </w:r>
+    </w:p>
+    <w:p>
+      <w:pPr>
+        <w:spacing w:line="300" w:lineRule="auto" w:before="0" w:after="120"/>
+        <w:jc w:val="center"/>
+      </w:pPr>
+      <w:r>
+        <w:rPr>
+          <w:rFonts w:ascii="宋体" w:hAnsi="宋体" w:eastAsia="宋体"/>
+          <w:b w:val="0"/>
+          <w:sz w:val="21"/>
+        </w:rPr>
+        <w:t>图 2-2 AI-Edu 多智能体系统实现架构图</w:t>
+      </w:r>
+    </w:p>
+    <w:p>
+      <w:pPr>
+        <w:spacing w:line="300" w:lineRule="auto" w:before="0" w:after="120"/>
+        <w:ind w:firstLine="420"/>
+      </w:pPr>
+      <w:r>
+        <w:rPr>
+          <w:rFonts w:ascii="宋体" w:hAnsi="宋体" w:eastAsia="宋体"/>
+          <w:b w:val="0"/>
+          <w:sz w:val="21"/>
+        </w:rPr>
+        <w:t>图 2-2 在图 2-1 总体分层的基础上，进一步展开 AI-Edu 系统的工程实现关系。该图按照客户端、FastAPI 服务层、多智能体工作流与业务服务层、模块数据管道、持久化与外部能力五个层次组织，突出说明多智能体能力并不是孤立的问答功能，而是嵌入课程建设、资源审核、学习证据汇聚、画像诊断、路径干预和教师服务的业务链路中。</w:t>
+      </w:r>
+    </w:p>
+    <w:p>
+      <w:pPr>
+        <w:spacing w:line="300" w:lineRule="auto" w:before="0" w:after="120"/>
+        <w:ind w:firstLine="420"/>
+      </w:pPr>
+      <w:r>
+        <w:rPr>
+          <w:rFonts w:ascii="宋体" w:hAnsi="宋体" w:eastAsia="宋体"/>
+          <w:b w:val="0"/>
+          <w:sz w:val="21"/>
+        </w:rPr>
+        <w:t>第一层为 Vue3 浏览器客户端，面向教师端、学生端、管理端、学习事件采集和认证入口。教师端承担课程底座维护、资源审核、看板查看和干预处理；学生端承担资源学习、测验作业、学习路径和进度查看；管理端承担用户、角色和基础数据维护；学习事件采集负责把资源进度、完成状态和互动记录回传后端；认证入口通过登录注册和 Session Cookie 建立用户身份。该层只负责交互和展示，不直接决定数据权限和业务状态。</w:t>
+      </w:r>
+    </w:p>
+    <w:p>
+      <w:pPr>
+        <w:spacing w:line="300" w:lineRule="auto" w:before="0" w:after="120"/>
+        <w:ind w:firstLine="420"/>
+      </w:pPr>
+      <w:r>
+        <w:rPr>
+          <w:rFonts w:ascii="宋体" w:hAnsi="宋体" w:eastAsia="宋体"/>
+          <w:b w:val="0"/>
+          <w:sz w:val="21"/>
+        </w:rPr>
+        <w:t>第二层为 FastAPI 服务层，按照业务域组织接口边界。auth / users 处理登录、会话和权限；course_digital_twin 处理课程结构、知识图谱、资源和能力映射；quiz / homework 承接客观题、主观题和代码题；digital_twin 承接学生画像、诊断和路径；dashboard / intervention 承接教师看板和干预包；industry / 5E 承接行业能力服务、行业情报和 5E 有效度摘要。前端请求统一通过 HTTPS / SSE 进入该层，后端再按业务域分发到对应服务和智能体工作流。</w:t>
+      </w:r>
+    </w:p>
+    <w:p>
+      <w:pPr>
+        <w:spacing w:line="300" w:lineRule="auto" w:before="0" w:after="120"/>
+        <w:ind w:firstLine="420"/>
+      </w:pPr>
+      <w:r>
+        <w:rPr>
+          <w:rFonts w:ascii="宋体" w:hAnsi="宋体" w:eastAsia="宋体"/>
+          <w:b w:val="0"/>
+          <w:sz w:val="21"/>
+        </w:rPr>
+        <w:t>第三层为多智能体工作流与业务服务层，是图 2-2 的核心。左侧的课程结构智能体、资源候选智能体、测评与作业智能体分别处理课程结构校验、外部资源候选、题目生成和代码题评测等任务；右侧的诊断与路径智能体、教师数字孪生智能体、行业与 5E 服务智能体分别处理掌握度与风险识别、班级看板与教师画像、能力映射与行业情报。中间的 AI-Edu 共享数据表面统一承载课程、节点、资源、学习证据、画像、诊断、路径、干预和能力映射等关键对象，保证各智能体围绕同一份业务事实进行读取、计算和回写。</w:t>
+      </w:r>
+    </w:p>
+    <w:p>
+      <w:pPr>
+        <w:spacing w:line="300" w:lineRule="auto" w:before="0" w:after="120"/>
+        <w:ind w:firstLine="420"/>
+      </w:pPr>
+      <w:r>
+        <w:rPr>
+          <w:rFonts w:ascii="宋体" w:hAnsi="宋体" w:eastAsia="宋体"/>
+          <w:b w:val="0"/>
+          <w:sz w:val="21"/>
+        </w:rPr>
+        <w:t>第四层为模块数据管道，展示核心业务对象从左到右的加工顺序。课程结构先形成章节、小节和知识点，随后完成资源绑定、审核、索引和启用；学生在测验、作业、资源学习和互动过程中产生学习证据；画像诊断模块根据证据形成掌握度、风险和薄弱点；路径干预模块生成推荐路径、干预包和任务；教师服务模块通过看板、能力映射和课程维护把运行结果反馈到教学改进。该管道强调数据口径连续性，避免每个页面各自重新解释同一份学习证据。</w:t>
+      </w:r>
+    </w:p>
+    <w:p>
+      <w:pPr>
+        <w:spacing w:line="300" w:lineRule="auto" w:before="0" w:after="120"/>
+        <w:ind w:firstLine="420"/>
+      </w:pPr>
+      <w:r>
+        <w:rPr>
+          <w:rFonts w:ascii="宋体" w:hAnsi="宋体" w:eastAsia="宋体"/>
+          <w:b w:val="0"/>
+          <w:sz w:val="21"/>
+        </w:rPr>
+        <w:t>第五层为持久化与外部能力。MySQL 数据库保存用户、课程、资源、测验、作业、画像、诊断、路径、干预和能力映射等结构化数据；文件与 RAG 资源保存上传资料、PDF、索引和解析结果；运行日志与调用记录保存会话、模型调用、事件和审计数据。外部服务与执行环境包括 LLM 与 Embeddings、B站 / YouTube / CSDN 资源检索以及 OJ 沙箱和判题能力。外部能力只作为模型推理、资源候选和代码执行支撑，最终课程发布、资源启用、作业终审和干预下发仍由系统业务状态和教师确认控制。</w:t>
+      </w:r>
+    </w:p>
     <w:p>
       <w:pPr>
         <w:pStyle w:val="Heading2"/>

</xml_diff>